<commit_message>
Knowledge - 4/17/2026 - Part 2
</commit_message>
<xml_diff>
--- a/Knowledge/3-Work knowledge/1-Software Engineering/1-Fundamentals/5-My Source/2-Data/2-Data Operations/1-Sources of Data/1-Sources of Data.docx
+++ b/Knowledge/3-Work knowledge/1-Software Engineering/1-Fundamentals/5-My Source/2-Data/2-Data Operations/1-Sources of Data/1-Sources of Data.docx
@@ -24,7 +24,7 @@
     <w:p>
       <w:r>
         <w:rPr>
-          <w:rFonts w:ascii="Arial" w:eastAsia="Arial" w:hAnsi="Arial" w:cs="Arial"/>
+          <w:rFonts w:ascii="Arial" w:hAnsi="Arial"/>
           <w:b/>
           <w:color w:val="000000"/>
           <w:sz w:val="18"/>
@@ -34,7 +34,7 @@
       </w:r>
       <w:r>
         <w:rPr>
-          <w:rFonts w:ascii="Arial" w:eastAsia="Arial" w:hAnsi="Arial" w:cs="Arial"/>
+          <w:rFonts w:ascii="Arial" w:hAnsi="Arial"/>
           <w:color w:val="000000"/>
           <w:sz w:val="18"/>
           <w:highlight w:val="lightGray"/>
@@ -43,7 +43,7 @@
       </w:r>
       <w:r>
         <w:rPr>
-          <w:rFonts w:ascii="Arial" w:eastAsia="Arial" w:hAnsi="Arial" w:cs="Arial"/>
+          <w:rFonts w:ascii="Arial" w:hAnsi="Arial"/>
           <w:b/>
           <w:color w:val="000000"/>
           <w:sz w:val="18"/>
@@ -53,34 +53,102 @@
       </w:r>
       <w:r>
         <w:rPr>
-          <w:rFonts w:ascii="Arial" w:eastAsia="Arial" w:hAnsi="Arial" w:cs="Arial"/>
-          <w:color w:val="000000"/>
-          <w:sz w:val="18"/>
-          <w:highlight w:val="lightGray"/>
-        </w:rPr>
-        <w:t xml:space="preserve"> [Chatgpt (GPT</w:t>
-      </w:r>
-      <w:r>
-        <w:rPr>
-          <w:rFonts w:ascii="Cambria Math" w:eastAsia="Cambria Math" w:hAnsi="Cambria Math" w:cs="Cambria Math"/>
-          <w:color w:val="000000"/>
-          <w:sz w:val="18"/>
-          <w:highlight w:val="lightGray"/>
-        </w:rPr>
-        <w:t>‑</w:t>
-      </w:r>
-      <w:r>
-        <w:rPr>
-          <w:rFonts w:ascii="Arial" w:eastAsia="Arial" w:hAnsi="Arial" w:cs="Arial"/>
-          <w:color w:val="000000"/>
-          <w:sz w:val="18"/>
-          <w:highlight w:val="lightGray"/>
-        </w:rPr>
-        <w:t xml:space="preserve">5 Mini)] </w:t>
-      </w:r>
-      <w:r>
-        <w:rPr>
-          <w:rFonts w:ascii="Arial" w:eastAsia="Arial" w:hAnsi="Arial" w:cs="Arial"/>
+          <w:rFonts w:ascii="Arial" w:hAnsi="Arial"/>
+          <w:color w:val="000000"/>
+          <w:sz w:val="18"/>
+          <w:highlight w:val="lightGray"/>
+        </w:rPr>
+        <w:t xml:space="preserve"> [</w:t>
+      </w:r>
+      <w:r>
+        <w:rPr>
+          <w:rFonts w:ascii="Arial" w:hAnsi="Arial" w:eastAsia="Arial" w:cs="Arial"/>
+          <w:b w:val="0"/>
+          <w:i w:val="0"/>
+          <w:color w:val="000000"/>
+          <w:sz w:val="18"/>
+          <w:highlight w:val="lightGray"/>
+        </w:rPr>
+        <w:t>C</w:t>
+      </w:r>
+      <w:r>
+        <w:rPr>
+          <w:rFonts w:ascii="Arial" w:hAnsi="Arial" w:eastAsia="Arial" w:cs="Arial"/>
+          <w:b w:val="0"/>
+          <w:i w:val="0"/>
+          <w:color w:val="000000"/>
+          <w:sz w:val="18"/>
+          <w:highlight w:val="lightGray"/>
+        </w:rPr>
+        <w:t>h</w:t>
+      </w:r>
+      <w:r>
+        <w:rPr>
+          <w:rFonts w:ascii="Arial" w:hAnsi="Arial" w:eastAsia="Arial" w:cs="Arial"/>
+          <w:b w:val="0"/>
+          <w:i w:val="0"/>
+          <w:color w:val="000000"/>
+          <w:sz w:val="18"/>
+          <w:highlight w:val="lightGray"/>
+        </w:rPr>
+        <w:t>a</w:t>
+      </w:r>
+      <w:r>
+        <w:rPr>
+          <w:rFonts w:ascii="Arial" w:hAnsi="Arial" w:eastAsia="Arial" w:cs="Arial"/>
+          <w:b w:val="0"/>
+          <w:i w:val="0"/>
+          <w:color w:val="000000"/>
+          <w:sz w:val="18"/>
+          <w:highlight w:val="lightGray"/>
+        </w:rPr>
+        <w:t>t</w:t>
+      </w:r>
+      <w:r>
+        <w:rPr>
+          <w:rFonts w:ascii="Arial" w:hAnsi="Arial" w:eastAsia="Arial" w:cs="Arial"/>
+          <w:b w:val="0"/>
+          <w:i w:val="0"/>
+          <w:color w:val="000000"/>
+          <w:sz w:val="18"/>
+          <w:highlight w:val="lightGray"/>
+        </w:rPr>
+        <w:t>G</w:t>
+      </w:r>
+      <w:r>
+        <w:rPr>
+          <w:rFonts w:ascii="Arial" w:hAnsi="Arial" w:eastAsia="Arial" w:cs="Arial"/>
+          <w:b w:val="0"/>
+          <w:i w:val="0"/>
+          <w:color w:val="000000"/>
+          <w:sz w:val="18"/>
+          <w:highlight w:val="lightGray"/>
+        </w:rPr>
+        <w:t>P</w:t>
+      </w:r>
+      <w:r>
+        <w:rPr>
+          <w:rFonts w:ascii="Arial" w:hAnsi="Arial" w:eastAsia="Arial" w:cs="Arial"/>
+          <w:b w:val="0"/>
+          <w:i w:val="0"/>
+          <w:color w:val="000000"/>
+          <w:sz w:val="18"/>
+          <w:highlight w:val="lightGray"/>
+        </w:rPr>
+        <w:t>T</w:t>
+      </w:r>
+      <w:r>
+        <w:rPr>
+          <w:rFonts w:ascii="Arial" w:hAnsi="Arial"/>
+          <w:color w:val="000000"/>
+          <w:sz w:val="18"/>
+          <w:highlight w:val="lightGray"/>
+        </w:rPr>
+        <w:t xml:space="preserve">] </w:t>
+      </w:r>
+      <w:r>
+        <w:rPr>
+          <w:rFonts w:ascii="Arial" w:hAnsi="Arial"/>
           <w:b/>
           <w:color w:val="000000"/>
           <w:sz w:val="18"/>
@@ -90,7 +158,7 @@
       </w:r>
       <w:r>
         <w:rPr>
-          <w:rFonts w:ascii="Arial" w:eastAsia="Arial" w:hAnsi="Arial" w:cs="Arial"/>
+          <w:rFonts w:ascii="Arial" w:hAnsi="Arial"/>
           <w:color w:val="000000"/>
           <w:sz w:val="18"/>
           <w:highlight w:val="lightGray"/>
@@ -224,7 +292,7 @@
     <w:p>
       <w:r>
         <w:rPr>
-          <w:rFonts w:ascii="Arial" w:eastAsia="Arial" w:hAnsi="Arial" w:cs="Arial"/>
+          <w:rFonts w:ascii="Arial" w:hAnsi="Arial"/>
           <w:b/>
           <w:color w:val="000000"/>
           <w:sz w:val="18"/>
@@ -234,7 +302,7 @@
       </w:r>
       <w:r>
         <w:rPr>
-          <w:rFonts w:ascii="Arial" w:eastAsia="Arial" w:hAnsi="Arial" w:cs="Arial"/>
+          <w:rFonts w:ascii="Arial" w:hAnsi="Arial"/>
           <w:color w:val="000000"/>
           <w:sz w:val="18"/>
           <w:highlight w:val="lightGray"/>
@@ -243,7 +311,7 @@
       </w:r>
       <w:r>
         <w:rPr>
-          <w:rFonts w:ascii="Arial" w:eastAsia="Arial" w:hAnsi="Arial" w:cs="Arial"/>
+          <w:rFonts w:ascii="Arial" w:hAnsi="Arial"/>
           <w:b/>
           <w:color w:val="000000"/>
           <w:sz w:val="18"/>
@@ -253,34 +321,102 @@
       </w:r>
       <w:r>
         <w:rPr>
-          <w:rFonts w:ascii="Arial" w:eastAsia="Arial" w:hAnsi="Arial" w:cs="Arial"/>
-          <w:color w:val="000000"/>
-          <w:sz w:val="18"/>
-          <w:highlight w:val="lightGray"/>
-        </w:rPr>
-        <w:t xml:space="preserve"> [Chatgpt (GPT</w:t>
-      </w:r>
-      <w:r>
-        <w:rPr>
-          <w:rFonts w:ascii="Cambria Math" w:eastAsia="Cambria Math" w:hAnsi="Cambria Math" w:cs="Cambria Math"/>
-          <w:color w:val="000000"/>
-          <w:sz w:val="18"/>
-          <w:highlight w:val="lightGray"/>
-        </w:rPr>
-        <w:t>‑</w:t>
-      </w:r>
-      <w:r>
-        <w:rPr>
-          <w:rFonts w:ascii="Arial" w:eastAsia="Arial" w:hAnsi="Arial" w:cs="Arial"/>
-          <w:color w:val="000000"/>
-          <w:sz w:val="18"/>
-          <w:highlight w:val="lightGray"/>
-        </w:rPr>
-        <w:t xml:space="preserve">5 Mini)] </w:t>
-      </w:r>
-      <w:r>
-        <w:rPr>
-          <w:rFonts w:ascii="Arial" w:eastAsia="Arial" w:hAnsi="Arial" w:cs="Arial"/>
+          <w:rFonts w:ascii="Arial" w:hAnsi="Arial"/>
+          <w:color w:val="000000"/>
+          <w:sz w:val="18"/>
+          <w:highlight w:val="lightGray"/>
+        </w:rPr>
+        <w:t xml:space="preserve"> [</w:t>
+      </w:r>
+      <w:r>
+        <w:rPr>
+          <w:rFonts w:ascii="Arial" w:hAnsi="Arial" w:eastAsia="Arial" w:cs="Arial"/>
+          <w:b w:val="0"/>
+          <w:i w:val="0"/>
+          <w:color w:val="000000"/>
+          <w:sz w:val="18"/>
+          <w:highlight w:val="lightGray"/>
+        </w:rPr>
+        <w:t>C</w:t>
+      </w:r>
+      <w:r>
+        <w:rPr>
+          <w:rFonts w:ascii="Arial" w:hAnsi="Arial" w:eastAsia="Arial" w:cs="Arial"/>
+          <w:b w:val="0"/>
+          <w:i w:val="0"/>
+          <w:color w:val="000000"/>
+          <w:sz w:val="18"/>
+          <w:highlight w:val="lightGray"/>
+        </w:rPr>
+        <w:t>h</w:t>
+      </w:r>
+      <w:r>
+        <w:rPr>
+          <w:rFonts w:ascii="Arial" w:hAnsi="Arial" w:eastAsia="Arial" w:cs="Arial"/>
+          <w:b w:val="0"/>
+          <w:i w:val="0"/>
+          <w:color w:val="000000"/>
+          <w:sz w:val="18"/>
+          <w:highlight w:val="lightGray"/>
+        </w:rPr>
+        <w:t>a</w:t>
+      </w:r>
+      <w:r>
+        <w:rPr>
+          <w:rFonts w:ascii="Arial" w:hAnsi="Arial" w:eastAsia="Arial" w:cs="Arial"/>
+          <w:b w:val="0"/>
+          <w:i w:val="0"/>
+          <w:color w:val="000000"/>
+          <w:sz w:val="18"/>
+          <w:highlight w:val="lightGray"/>
+        </w:rPr>
+        <w:t>t</w:t>
+      </w:r>
+      <w:r>
+        <w:rPr>
+          <w:rFonts w:ascii="Arial" w:hAnsi="Arial" w:eastAsia="Arial" w:cs="Arial"/>
+          <w:b w:val="0"/>
+          <w:i w:val="0"/>
+          <w:color w:val="000000"/>
+          <w:sz w:val="18"/>
+          <w:highlight w:val="lightGray"/>
+        </w:rPr>
+        <w:t>G</w:t>
+      </w:r>
+      <w:r>
+        <w:rPr>
+          <w:rFonts w:ascii="Arial" w:hAnsi="Arial" w:eastAsia="Arial" w:cs="Arial"/>
+          <w:b w:val="0"/>
+          <w:i w:val="0"/>
+          <w:color w:val="000000"/>
+          <w:sz w:val="18"/>
+          <w:highlight w:val="lightGray"/>
+        </w:rPr>
+        <w:t>P</w:t>
+      </w:r>
+      <w:r>
+        <w:rPr>
+          <w:rFonts w:ascii="Arial" w:hAnsi="Arial" w:eastAsia="Arial" w:cs="Arial"/>
+          <w:b w:val="0"/>
+          <w:i w:val="0"/>
+          <w:color w:val="000000"/>
+          <w:sz w:val="18"/>
+          <w:highlight w:val="lightGray"/>
+        </w:rPr>
+        <w:t>T</w:t>
+      </w:r>
+      <w:r>
+        <w:rPr>
+          <w:rFonts w:ascii="Arial" w:hAnsi="Arial"/>
+          <w:color w:val="000000"/>
+          <w:sz w:val="18"/>
+          <w:highlight w:val="lightGray"/>
+        </w:rPr>
+        <w:t xml:space="preserve">] </w:t>
+      </w:r>
+      <w:r>
+        <w:rPr>
+          <w:rFonts w:ascii="Arial" w:hAnsi="Arial"/>
           <w:b/>
           <w:color w:val="000000"/>
           <w:sz w:val="18"/>
@@ -290,7 +426,7 @@
       </w:r>
       <w:r>
         <w:rPr>
-          <w:rFonts w:ascii="Arial" w:eastAsia="Arial" w:hAnsi="Arial" w:cs="Arial"/>
+          <w:rFonts w:ascii="Arial" w:hAnsi="Arial"/>
           <w:color w:val="000000"/>
           <w:sz w:val="18"/>
           <w:highlight w:val="lightGray"/>
@@ -976,7 +1112,7 @@
     <w:p>
       <w:r>
         <w:rPr>
-          <w:rFonts w:ascii="Arial" w:eastAsia="Arial" w:hAnsi="Arial" w:cs="Arial"/>
+          <w:rFonts w:ascii="Arial" w:hAnsi="Arial"/>
           <w:b/>
           <w:color w:val="000000"/>
           <w:sz w:val="18"/>
@@ -986,7 +1122,7 @@
       </w:r>
       <w:r>
         <w:rPr>
-          <w:rFonts w:ascii="Arial" w:eastAsia="Arial" w:hAnsi="Arial" w:cs="Arial"/>
+          <w:rFonts w:ascii="Arial" w:hAnsi="Arial"/>
           <w:color w:val="000000"/>
           <w:sz w:val="18"/>
           <w:highlight w:val="lightGray"/>
@@ -995,7 +1131,7 @@
       </w:r>
       <w:r>
         <w:rPr>
-          <w:rFonts w:ascii="Arial" w:eastAsia="Arial" w:hAnsi="Arial" w:cs="Arial"/>
+          <w:rFonts w:ascii="Arial" w:hAnsi="Arial"/>
           <w:b/>
           <w:color w:val="000000"/>
           <w:sz w:val="18"/>
@@ -1005,34 +1141,102 @@
       </w:r>
       <w:r>
         <w:rPr>
-          <w:rFonts w:ascii="Arial" w:eastAsia="Arial" w:hAnsi="Arial" w:cs="Arial"/>
-          <w:color w:val="000000"/>
-          <w:sz w:val="18"/>
-          <w:highlight w:val="lightGray"/>
-        </w:rPr>
-        <w:t xml:space="preserve"> [Chatgpt (GPT</w:t>
-      </w:r>
-      <w:r>
-        <w:rPr>
-          <w:rFonts w:ascii="Cambria Math" w:eastAsia="Cambria Math" w:hAnsi="Cambria Math" w:cs="Cambria Math"/>
-          <w:color w:val="000000"/>
-          <w:sz w:val="18"/>
-          <w:highlight w:val="lightGray"/>
-        </w:rPr>
-        <w:t>‑</w:t>
-      </w:r>
-      <w:r>
-        <w:rPr>
-          <w:rFonts w:ascii="Arial" w:eastAsia="Arial" w:hAnsi="Arial" w:cs="Arial"/>
-          <w:color w:val="000000"/>
-          <w:sz w:val="18"/>
-          <w:highlight w:val="lightGray"/>
-        </w:rPr>
-        <w:t xml:space="preserve">5 Mini)] </w:t>
-      </w:r>
-      <w:r>
-        <w:rPr>
-          <w:rFonts w:ascii="Arial" w:eastAsia="Arial" w:hAnsi="Arial" w:cs="Arial"/>
+          <w:rFonts w:ascii="Arial" w:hAnsi="Arial"/>
+          <w:color w:val="000000"/>
+          <w:sz w:val="18"/>
+          <w:highlight w:val="lightGray"/>
+        </w:rPr>
+        <w:t xml:space="preserve"> [</w:t>
+      </w:r>
+      <w:r>
+        <w:rPr>
+          <w:rFonts w:ascii="Arial" w:hAnsi="Arial" w:eastAsia="Arial" w:cs="Arial"/>
+          <w:b w:val="0"/>
+          <w:i w:val="0"/>
+          <w:color w:val="000000"/>
+          <w:sz w:val="18"/>
+          <w:highlight w:val="lightGray"/>
+        </w:rPr>
+        <w:t>C</w:t>
+      </w:r>
+      <w:r>
+        <w:rPr>
+          <w:rFonts w:ascii="Arial" w:hAnsi="Arial" w:eastAsia="Arial" w:cs="Arial"/>
+          <w:b w:val="0"/>
+          <w:i w:val="0"/>
+          <w:color w:val="000000"/>
+          <w:sz w:val="18"/>
+          <w:highlight w:val="lightGray"/>
+        </w:rPr>
+        <w:t>h</w:t>
+      </w:r>
+      <w:r>
+        <w:rPr>
+          <w:rFonts w:ascii="Arial" w:hAnsi="Arial" w:eastAsia="Arial" w:cs="Arial"/>
+          <w:b w:val="0"/>
+          <w:i w:val="0"/>
+          <w:color w:val="000000"/>
+          <w:sz w:val="18"/>
+          <w:highlight w:val="lightGray"/>
+        </w:rPr>
+        <w:t>a</w:t>
+      </w:r>
+      <w:r>
+        <w:rPr>
+          <w:rFonts w:ascii="Arial" w:hAnsi="Arial" w:eastAsia="Arial" w:cs="Arial"/>
+          <w:b w:val="0"/>
+          <w:i w:val="0"/>
+          <w:color w:val="000000"/>
+          <w:sz w:val="18"/>
+          <w:highlight w:val="lightGray"/>
+        </w:rPr>
+        <w:t>t</w:t>
+      </w:r>
+      <w:r>
+        <w:rPr>
+          <w:rFonts w:ascii="Arial" w:hAnsi="Arial" w:eastAsia="Arial" w:cs="Arial"/>
+          <w:b w:val="0"/>
+          <w:i w:val="0"/>
+          <w:color w:val="000000"/>
+          <w:sz w:val="18"/>
+          <w:highlight w:val="lightGray"/>
+        </w:rPr>
+        <w:t>G</w:t>
+      </w:r>
+      <w:r>
+        <w:rPr>
+          <w:rFonts w:ascii="Arial" w:hAnsi="Arial" w:eastAsia="Arial" w:cs="Arial"/>
+          <w:b w:val="0"/>
+          <w:i w:val="0"/>
+          <w:color w:val="000000"/>
+          <w:sz w:val="18"/>
+          <w:highlight w:val="lightGray"/>
+        </w:rPr>
+        <w:t>P</w:t>
+      </w:r>
+      <w:r>
+        <w:rPr>
+          <w:rFonts w:ascii="Arial" w:hAnsi="Arial" w:eastAsia="Arial" w:cs="Arial"/>
+          <w:b w:val="0"/>
+          <w:i w:val="0"/>
+          <w:color w:val="000000"/>
+          <w:sz w:val="18"/>
+          <w:highlight w:val="lightGray"/>
+        </w:rPr>
+        <w:t>T</w:t>
+      </w:r>
+      <w:r>
+        <w:rPr>
+          <w:rFonts w:ascii="Arial" w:hAnsi="Arial"/>
+          <w:color w:val="000000"/>
+          <w:sz w:val="18"/>
+          <w:highlight w:val="lightGray"/>
+        </w:rPr>
+        <w:t xml:space="preserve">] </w:t>
+      </w:r>
+      <w:r>
+        <w:rPr>
+          <w:rFonts w:ascii="Arial" w:hAnsi="Arial"/>
           <w:b/>
           <w:color w:val="000000"/>
           <w:sz w:val="18"/>
@@ -1042,7 +1246,7 @@
       </w:r>
       <w:r>
         <w:rPr>
-          <w:rFonts w:ascii="Arial" w:eastAsia="Arial" w:hAnsi="Arial" w:cs="Arial"/>
+          <w:rFonts w:ascii="Arial" w:hAnsi="Arial"/>
           <w:color w:val="000000"/>
           <w:sz w:val="18"/>
           <w:highlight w:val="lightGray"/>

</xml_diff>